<commit_message>
This is till Sprint 3
</commit_message>
<xml_diff>
--- a/E-Commerce Sales Analysis.docx
+++ b/E-Commerce Sales Analysis.docx
@@ -1,6 +1,6 @@
 
 <file path=word/document.xml><?xml version="1.0" encoding="utf-8"?>
-<w:document xmlns:wpc="http://schemas.microsoft.com/office/word/2010/wordprocessingCanvas" xmlns:cx="http://schemas.microsoft.com/office/drawing/2014/chartex" xmlns:cx1="http://schemas.microsoft.com/office/drawing/2015/9/8/chartex" xmlns:cx2="http://schemas.microsoft.com/office/drawing/2015/10/21/chartex" xmlns:cx3="http://schemas.microsoft.com/office/drawing/2016/5/9/chartex" xmlns:cx4="http://schemas.microsoft.com/office/drawing/2016/5/10/chartex" xmlns:cx5="http://schemas.microsoft.com/office/drawing/2016/5/11/chartex" xmlns:cx6="http://schemas.microsoft.com/office/drawing/2016/5/12/chartex" xmlns:cx7="http://schemas.microsoft.com/office/drawing/2016/5/13/chartex" xmlns:cx8="http://schemas.microsoft.com/office/drawing/2016/5/14/chartex" xmlns:mc="http://schemas.openxmlformats.org/markup-compatibility/2006" xmlns:aink="http://schemas.microsoft.com/office/drawing/2016/ink" xmlns:am3d="http://schemas.microsoft.com/office/drawing/2017/model3d" xmlns:o="urn:schemas-microsoft-com:office:office" xmlns:oel="http://schemas.microsoft.com/office/2019/extlst" xmlns:r="http://schemas.openxmlformats.org/officeDocument/2006/relationships" xmlns:m="http://schemas.openxmlformats.org/officeDocument/2006/math" xmlns:v="urn:schemas-microsoft-com:vml" xmlns:wp14="http://schemas.microsoft.com/office/word/2010/wordprocessingDrawing" xmlns:wp="http://schemas.openxmlformats.org/drawingml/2006/wordprocessingDrawing" xmlns:w10="urn:schemas-microsoft-com:office:word" xmlns:w="http://schemas.openxmlformats.org/wordprocessingml/2006/main" xmlns:w14="http://schemas.microsoft.com/office/word/2010/wordml" xmlns:w15="http://schemas.microsoft.com/office/word/2012/wordml" xmlns:w16cei="http://schemas.microsoft.com/office/word/2026/wordml/cei" xmlns:w16cex="http://schemas.microsoft.com/office/word/2018/wordml/cex" xmlns:w16cid="http://schemas.microsoft.com/office/word/2016/wordml/cid" xmlns:w16="http://schemas.microsoft.com/office/word/2018/wordml" xmlns:w16du="http://schemas.microsoft.com/office/word/2023/wordml/word16du" xmlns:w16sdtdh="http://schemas.microsoft.com/office/word/2020/wordml/sdtdatahash" xmlns:w16sdtfl="http://schemas.microsoft.com/office/word/2024/wordml/sdtformatlock" xmlns:w16se="http://schemas.microsoft.com/office/word/2015/wordml/symex" xmlns:wpg="http://schemas.microsoft.com/office/word/2010/wordprocessingGroup" xmlns:wpi="http://schemas.microsoft.com/office/word/2010/wordprocessingInk" xmlns:wne="http://schemas.microsoft.com/office/word/2006/wordml" xmlns:wps="http://schemas.microsoft.com/office/word/2010/wordprocessingShape" mc:Ignorable="w14 w15 w16se w16cid w16 w16cex w16sdtdh w16sdtfl w16du wp14">
+<w:document xmlns:wpc="http://schemas.microsoft.com/office/word/2010/wordprocessingCanvas" xmlns:cx="http://schemas.microsoft.com/office/drawing/2014/chartex" xmlns:cx1="http://schemas.microsoft.com/office/drawing/2015/9/8/chartex" xmlns:cx2="http://schemas.microsoft.com/office/drawing/2015/10/21/chartex" xmlns:cx3="http://schemas.microsoft.com/office/drawing/2016/5/9/chartex" xmlns:cx4="http://schemas.microsoft.com/office/drawing/2016/5/10/chartex" xmlns:cx5="http://schemas.microsoft.com/office/drawing/2016/5/11/chartex" xmlns:cx6="http://schemas.microsoft.com/office/drawing/2016/5/12/chartex" xmlns:cx7="http://schemas.microsoft.com/office/drawing/2016/5/13/chartex" xmlns:cx8="http://schemas.microsoft.com/office/drawing/2016/5/14/chartex" xmlns:mc="http://schemas.openxmlformats.org/markup-compatibility/2006" xmlns:aink="http://schemas.microsoft.com/office/drawing/2016/ink" xmlns:am3d="http://schemas.microsoft.com/office/drawing/2017/model3d" xmlns:o="urn:schemas-microsoft-com:office:office" xmlns:oel="http://schemas.microsoft.com/office/2019/extlst" xmlns:r="http://schemas.openxmlformats.org/officeDocument/2006/relationships" xmlns:m="http://schemas.openxmlformats.org/officeDocument/2006/math" xmlns:v="urn:schemas-microsoft-com:vml" xmlns:wp14="http://schemas.microsoft.com/office/word/2010/wordprocessingDrawing" xmlns:wp="http://schemas.openxmlformats.org/drawingml/2006/wordprocessingDrawing" xmlns:w10="urn:schemas-microsoft-com:office:word" xmlns:w="http://schemas.openxmlformats.org/wordprocessingml/2006/main" xmlns:w14="http://schemas.microsoft.com/office/word/2010/wordml" xmlns:w15="http://schemas.microsoft.com/office/word/2012/wordml" xmlns:w16cex="http://schemas.microsoft.com/office/word/2018/wordml/cex" xmlns:w16cid="http://schemas.microsoft.com/office/word/2016/wordml/cid" xmlns:w16="http://schemas.microsoft.com/office/word/2018/wordml" xmlns:w16du="http://schemas.microsoft.com/office/word/2023/wordml/word16du" xmlns:w16sdtdh="http://schemas.microsoft.com/office/word/2020/wordml/sdtdatahash" xmlns:w16sdtfl="http://schemas.microsoft.com/office/word/2024/wordml/sdtformatlock" xmlns:w16se="http://schemas.microsoft.com/office/word/2015/wordml/symex" xmlns:wpg="http://schemas.microsoft.com/office/word/2010/wordprocessingGroup" xmlns:wpi="http://schemas.microsoft.com/office/word/2010/wordprocessingInk" xmlns:wne="http://schemas.microsoft.com/office/word/2006/wordml" xmlns:wps="http://schemas.microsoft.com/office/word/2010/wordprocessingShape" mc:Ignorable="w14 w15 w16se w16cid w16 w16cex w16sdtdh w16sdtfl w16du wp14">
   <w:body>
     <w:p>
       <w:pPr>
@@ -97,7 +97,7 @@
               </wp:anchor>
             </w:drawing>
           </mc:Choice>
-          <mc:Fallback>
+          <mc:Fallback xmlns:w16cei="http://schemas.microsoft.com/office/word/2026/wordml/cei">
             <w:pict>
               <v:rect w14:anchorId="313EF4E5" id="Rectangle 44" o:spid="_x0000_s1026" style="position:absolute;margin-left:3.05pt;margin-top:-9.95pt;width:585.75pt;height:829.85pt;z-index:251700224;visibility:visible;mso-wrap-style:square;mso-width-percent:0;mso-height-percent:0;mso-wrap-distance-left:9pt;mso-wrap-distance-top:0;mso-wrap-distance-right:9pt;mso-wrap-distance-bottom:0;mso-position-horizontal:absolute;mso-position-horizontal-relative:page;mso-position-vertical:absolute;mso-position-vertical-relative:text;mso-width-percent:0;mso-height-percent:0;mso-width-relative:margin;mso-height-relative:margin;v-text-anchor:middle" o:gfxdata="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" filled="f" strokecolor="#1f4d78 [1608]" strokeweight="1pt">
                 <w10:wrap anchorx="page"/>
@@ -205,7 +205,7 @@
               </wp:anchor>
             </w:drawing>
           </mc:Choice>
-          <mc:Fallback>
+          <mc:Fallback xmlns:w16cei="http://schemas.microsoft.com/office/word/2026/wordml/cei">
             <w:pict>
               <v:oval w14:anchorId="700F57BA" id="Oval 7" o:spid="_x0000_s1026" style="position:absolute;margin-left:56.4pt;margin-top:11.8pt;width:11pt;height:13.6pt;z-index:251663360;visibility:visible;mso-wrap-style:square;mso-width-percent:0;mso-height-percent:0;mso-wrap-distance-left:9pt;mso-wrap-distance-top:0;mso-wrap-distance-right:9pt;mso-wrap-distance-bottom:0;mso-position-horizontal:absolute;mso-position-horizontal-relative:text;mso-position-vertical:absolute;mso-position-vertical-relative:text;mso-width-percent:0;mso-height-percent:0;mso-width-relative:margin;mso-height-relative:margin;v-text-anchor:middle" o:gfxdata="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" fillcolor="#4472c4 [3204]" strokecolor="#09101d [484]" strokeweight="1pt">
                 <v:stroke joinstyle="miter"/>
@@ -378,7 +378,7 @@
               </wp:anchor>
             </w:drawing>
           </mc:Choice>
-          <mc:Fallback>
+          <mc:Fallback xmlns:w16cei="http://schemas.microsoft.com/office/word/2026/wordml/cei">
             <w:pict>
               <v:line w14:anchorId="5D902DEF" id="Straight Connector 2" o:spid="_x0000_s1026" style="position:absolute;flip:y;z-index:251659264;visibility:visible;mso-wrap-style:square;mso-width-percent:0;mso-height-percent:0;mso-wrap-distance-left:9pt;mso-wrap-distance-top:0;mso-wrap-distance-right:9pt;mso-wrap-distance-bottom:0;mso-position-horizontal:absolute;mso-position-horizontal-relative:text;mso-position-vertical:absolute;mso-position-vertical-relative:text;mso-width-percent:0;mso-height-percent:0;mso-width-relative:margin;mso-height-relative:margin" from="62.25pt,.65pt" to="490.35pt,1.9pt" o:gfxdata="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" strokecolor="#4472c4 [3204]" strokeweight="1pt">
                 <v:stroke joinstyle="miter"/>
@@ -552,51 +552,7 @@
                 <w:sz w:val="20"/>
                 <w:szCs w:val="20"/>
               </w:rPr>
-              <w:t xml:space="preserve">This project aims to </w:t>
-            </w:r>
-            <w:r>
-              <w:rPr>
-                <w:rFonts w:ascii="Aptos Display" w:hAnsi="Aptos Display"/>
-                <w:b/>
-                <w:bCs/>
-                <w:color w:val="000000" w:themeColor="text1"/>
-                <w:sz w:val="20"/>
-                <w:szCs w:val="20"/>
-              </w:rPr>
-              <w:t>analyse</w:t>
-            </w:r>
-            <w:r>
-              <w:rPr>
-                <w:rFonts w:ascii="Aptos Display" w:hAnsi="Aptos Display"/>
-                <w:b/>
-                <w:bCs/>
-                <w:color w:val="000000" w:themeColor="text1"/>
-                <w:sz w:val="20"/>
-                <w:szCs w:val="20"/>
-              </w:rPr>
-              <w:t xml:space="preserve"> e-commerce sales, customer </w:t>
-            </w:r>
-            <w:r>
-              <w:rPr>
-                <w:rFonts w:ascii="Aptos Display" w:hAnsi="Aptos Display"/>
-                <w:b/>
-                <w:bCs/>
-                <w:color w:val="000000" w:themeColor="text1"/>
-                <w:sz w:val="20"/>
-                <w:szCs w:val="20"/>
-              </w:rPr>
-              <w:t>behaviours</w:t>
-            </w:r>
-            <w:r>
-              <w:rPr>
-                <w:rFonts w:ascii="Aptos Display" w:hAnsi="Aptos Display"/>
-                <w:b/>
-                <w:bCs/>
-                <w:color w:val="000000" w:themeColor="text1"/>
-                <w:sz w:val="20"/>
-                <w:szCs w:val="20"/>
-              </w:rPr>
-              <w:t>, product performance, reviews, and geographical data to understand key business trends. The goal is to identify factors that influence customer conversion and retention and provide data-driven insights for business growth.</w:t>
+              <w:t>This project aims to analyse e-commerce sales, customer behaviours, product performance, reviews, and geographical data to understand key business trends. The goal is to identify factors that influence customer conversion and retention and provide data-driven insights for business growth.</w:t>
             </w:r>
             <w:r>
               <w:rPr>
@@ -755,7 +711,7 @@
                     </wp:anchor>
                   </w:drawing>
                 </mc:Choice>
-                <mc:Fallback>
+                <mc:Fallback xmlns:w16cei="http://schemas.microsoft.com/office/word/2026/wordml/cei">
                   <w:pict>
                     <v:oval w14:anchorId="7C4DA7A2" id="Oval 7" o:spid="_x0000_s1026" style="position:absolute;margin-left:196.45pt;margin-top:-48.3pt;width:11pt;height:13.6pt;z-index:251665408;visibility:visible;mso-wrap-style:square;mso-width-percent:0;mso-height-percent:0;mso-wrap-distance-left:9pt;mso-wrap-distance-top:0;mso-wrap-distance-right:9pt;mso-wrap-distance-bottom:0;mso-position-horizontal:absolute;mso-position-horizontal-relative:text;mso-position-vertical:absolute;mso-position-vertical-relative:text;mso-width-percent:0;mso-height-percent:0;mso-width-relative:margin;mso-height-relative:margin;v-text-anchor:middle" o:gfxdata="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" fillcolor="#4472c4 [3204]" strokecolor="#09101d [484]" strokeweight="1pt">
                       <v:stroke joinstyle="miter"/>
@@ -1014,15 +970,7 @@
                 <w:sz w:val="20"/>
                 <w:szCs w:val="20"/>
               </w:rPr>
-              <w:t>What opportunities can help increase revenue and customer loyalty</w:t>
-            </w:r>
-            <w:r>
-              <w:rPr>
-                <w:rFonts w:ascii="Aptos Display" w:hAnsi="Aptos Display"/>
-                <w:sz w:val="20"/>
-                <w:szCs w:val="20"/>
-              </w:rPr>
-              <w:t>?</w:t>
+              <w:t>What opportunities can help increase revenue and customer loyalty?</w:t>
             </w:r>
           </w:p>
         </w:tc>
@@ -1142,61 +1090,7 @@
           <w:sz w:val="20"/>
           <w:szCs w:val="20"/>
         </w:rPr>
-        <w:t xml:space="preserve">To </w:t>
-      </w:r>
-      <w:r>
-        <w:rPr>
-          <w:b/>
-          <w:bCs/>
-          <w:sz w:val="20"/>
-          <w:szCs w:val="20"/>
-        </w:rPr>
-        <w:t>analyses</w:t>
-      </w:r>
-      <w:r>
-        <w:rPr>
-          <w:b/>
-          <w:bCs/>
-          <w:sz w:val="20"/>
-          <w:szCs w:val="20"/>
-        </w:rPr>
-        <w:t xml:space="preserve"> e-commerce sales and customer </w:t>
-      </w:r>
-      <w:r>
-        <w:rPr>
-          <w:b/>
-          <w:bCs/>
-          <w:sz w:val="20"/>
-          <w:szCs w:val="20"/>
-        </w:rPr>
-        <w:t>behaviour</w:t>
-      </w:r>
-      <w:r>
-        <w:rPr>
-          <w:b/>
-          <w:bCs/>
-          <w:sz w:val="20"/>
-          <w:szCs w:val="20"/>
-        </w:rPr>
-        <w:t xml:space="preserve"> using Excel, SQL, Python, statistical analysis, and Power BI to identify patterns in sales performance, customer purchasing </w:t>
-      </w:r>
-      <w:r>
-        <w:rPr>
-          <w:b/>
-          <w:bCs/>
-          <w:sz w:val="20"/>
-          <w:szCs w:val="20"/>
-        </w:rPr>
-        <w:t>behaviour</w:t>
-      </w:r>
-      <w:r>
-        <w:rPr>
-          <w:b/>
-          <w:bCs/>
-          <w:sz w:val="20"/>
-          <w:szCs w:val="20"/>
-        </w:rPr>
-        <w:t>, product performance, customer satisfaction, and regional trends, and convert these findings into actionable business insights for improving customer conversion, retention, and overall business performance</w:t>
+        <w:t>To analyses e-commerce sales and customer behaviour using Excel, SQL, Python, statistical analysis, and Power BI to identify patterns in sales performance, customer purchasing behaviour, product performance, customer satisfaction, and regional trends, and convert these findings into actionable business insights for improving customer conversion, retention, and overall business performance</w:t>
       </w:r>
       <w:r>
         <w:rPr>
@@ -1775,18 +1669,7 @@
                 <w:sz w:val="26"/>
                 <w:szCs w:val="26"/>
               </w:rPr>
-              <w:t>ORDER ITEMS</w:t>
-            </w:r>
-            <w:r>
-              <w:rPr>
-                <w:rFonts w:ascii="Aptos Display" w:hAnsi="Aptos Display"/>
-                <w:b/>
-                <w:bCs/>
-                <w:color w:val="000000" w:themeColor="text1"/>
-                <w:sz w:val="26"/>
-                <w:szCs w:val="26"/>
-              </w:rPr>
-              <w:t xml:space="preserve"> </w:t>
+              <w:t xml:space="preserve">ORDER ITEMS </w:t>
             </w:r>
           </w:p>
           <w:p>
@@ -2707,29 +2590,7 @@
                 <w:sz w:val="20"/>
                 <w:szCs w:val="20"/>
               </w:rPr>
-              <w:t>Data cleaning, initial</w:t>
-            </w:r>
-            <w:r>
-              <w:rPr>
-                <w:rFonts w:ascii="Aptos Display" w:hAnsi="Aptos Display"/>
-                <w:b/>
-                <w:bCs/>
-                <w:color w:val="000000" w:themeColor="text1"/>
-                <w:sz w:val="20"/>
-                <w:szCs w:val="20"/>
-              </w:rPr>
-              <w:t xml:space="preserve"> </w:t>
-            </w:r>
-            <w:r>
-              <w:rPr>
-                <w:rFonts w:ascii="Aptos Display" w:hAnsi="Aptos Display"/>
-                <w:b/>
-                <w:bCs/>
-                <w:color w:val="000000" w:themeColor="text1"/>
-                <w:sz w:val="20"/>
-                <w:szCs w:val="20"/>
-              </w:rPr>
-              <w:t>analysis, Pivot Tables</w:t>
+              <w:t>Data cleaning, initial analysis, Pivot Tables</w:t>
             </w:r>
           </w:p>
         </w:tc>
@@ -4663,7 +4524,7 @@
           <w:szCs w:val="18"/>
         </w:rPr>
         <w:drawing>
-          <wp:anchor distT="0" distB="0" distL="114300" distR="114300" simplePos="0" relativeHeight="251695104" behindDoc="0" locked="0" layoutInCell="1" allowOverlap="1" wp14:anchorId="03414A7F" wp14:editId="1736B19B">
+          <wp:anchor distT="0" distB="0" distL="114300" distR="114300" simplePos="0" relativeHeight="251695104" behindDoc="0" locked="0" layoutInCell="1" allowOverlap="1" wp14:anchorId="03414A7F" wp14:editId="3BD1F1BF">
             <wp:simplePos x="0" y="0"/>
             <wp:positionH relativeFrom="column">
               <wp:posOffset>1615009</wp:posOffset>
@@ -5679,18 +5540,170 @@
           <w:szCs w:val="26"/>
         </w:rPr>
       </w:pPr>
-    </w:p>
-    <w:p>
-      <w:pPr>
+      <w:r>
         <w:rPr>
           <w:rFonts w:ascii="Aptos Display" w:hAnsi="Aptos Display"/>
           <w:b/>
           <w:bCs/>
-          <w:color w:val="1F4E79" w:themeColor="accent5" w:themeShade="80"/>
-          <w:sz w:val="26"/>
-          <w:szCs w:val="26"/>
+          <w:noProof/>
+          <w:color w:val="5B9BD5" w:themeColor="accent5"/>
+          <w:sz w:val="48"/>
+          <w:szCs w:val="48"/>
         </w:rPr>
-      </w:pPr>
+        <w:lastRenderedPageBreak/>
+        <w:drawing>
+          <wp:anchor distT="0" distB="0" distL="114300" distR="114300" simplePos="0" relativeHeight="251703296" behindDoc="0" locked="0" layoutInCell="1" allowOverlap="1" wp14:anchorId="4384D4EC" wp14:editId="77D0B621">
+            <wp:simplePos x="0" y="0"/>
+            <wp:positionH relativeFrom="margin">
+              <wp:align>left</wp:align>
+            </wp:positionH>
+            <wp:positionV relativeFrom="paragraph">
+              <wp:posOffset>-72014</wp:posOffset>
+            </wp:positionV>
+            <wp:extent cx="333213" cy="333213"/>
+            <wp:effectExtent l="0" t="0" r="0" b="0"/>
+            <wp:wrapNone/>
+            <wp:docPr id="647391103" name="Picture 6"/>
+            <wp:cNvGraphicFramePr>
+              <a:graphicFrameLocks xmlns:a="http://schemas.openxmlformats.org/drawingml/2006/main" noChangeAspect="1"/>
+            </wp:cNvGraphicFramePr>
+            <a:graphic xmlns:a="http://schemas.openxmlformats.org/drawingml/2006/main">
+              <a:graphicData uri="http://schemas.openxmlformats.org/drawingml/2006/picture">
+                <pic:pic xmlns:pic="http://schemas.openxmlformats.org/drawingml/2006/picture">
+                  <pic:nvPicPr>
+                    <pic:cNvPr id="647391103" name="Picture 647391103"/>
+                    <pic:cNvPicPr/>
+                  </pic:nvPicPr>
+                  <pic:blipFill>
+                    <a:blip r:embed="rId54" cstate="print">
+                      <a:duotone>
+                        <a:prstClr val="black"/>
+                        <a:schemeClr val="accent1">
+                          <a:tint val="45000"/>
+                          <a:satMod val="400000"/>
+                        </a:schemeClr>
+                      </a:duotone>
+                      <a:extLst>
+                        <a:ext uri="{28A0092B-C50C-407E-A947-70E740481C1C}">
+                          <a14:useLocalDpi xmlns:a14="http://schemas.microsoft.com/office/drawing/2010/main" val="0"/>
+                        </a:ext>
+                      </a:extLst>
+                    </a:blip>
+                    <a:stretch>
+                      <a:fillRect/>
+                    </a:stretch>
+                  </pic:blipFill>
+                  <pic:spPr>
+                    <a:xfrm>
+                      <a:off x="0" y="0"/>
+                      <a:ext cx="333213" cy="333213"/>
+                    </a:xfrm>
+                    <a:prstGeom prst="rect">
+                      <a:avLst/>
+                    </a:prstGeom>
+                  </pic:spPr>
+                </pic:pic>
+              </a:graphicData>
+            </a:graphic>
+            <wp14:sizeRelH relativeFrom="margin">
+              <wp14:pctWidth>0</wp14:pctWidth>
+            </wp14:sizeRelH>
+            <wp14:sizeRelV relativeFrom="margin">
+              <wp14:pctHeight>0</wp14:pctHeight>
+            </wp14:sizeRelV>
+          </wp:anchor>
+        </w:drawing>
+      </w:r>
+      <w:r>
+        <w:rPr>
+          <w:rFonts w:ascii="Aptos Display" w:hAnsi="Aptos Display"/>
+          <w:b/>
+          <w:bCs/>
+          <w:noProof/>
+          <w:color w:val="5B9BD5" w:themeColor="accent5"/>
+          <w:sz w:val="48"/>
+          <w:szCs w:val="48"/>
+        </w:rPr>
+        <mc:AlternateContent>
+          <mc:Choice Requires="wps">
+            <w:drawing>
+              <wp:anchor distT="0" distB="0" distL="114300" distR="114300" simplePos="0" relativeHeight="251702272" behindDoc="0" locked="0" layoutInCell="1" allowOverlap="1" wp14:anchorId="7F7105DF" wp14:editId="22B4CB13">
+                <wp:simplePos x="0" y="0"/>
+                <wp:positionH relativeFrom="page">
+                  <wp:posOffset>61993</wp:posOffset>
+                </wp:positionH>
+                <wp:positionV relativeFrom="paragraph">
+                  <wp:posOffset>-110598</wp:posOffset>
+                </wp:positionV>
+                <wp:extent cx="7377032" cy="10546597"/>
+                <wp:effectExtent l="0" t="0" r="14605" b="26670"/>
+                <wp:wrapNone/>
+                <wp:docPr id="623765414" name="Rectangle 44"/>
+                <wp:cNvGraphicFramePr/>
+                <a:graphic xmlns:a="http://schemas.openxmlformats.org/drawingml/2006/main">
+                  <a:graphicData uri="http://schemas.microsoft.com/office/word/2010/wordprocessingShape">
+                    <wps:wsp>
+                      <wps:cNvSpPr/>
+                      <wps:spPr>
+                        <a:xfrm>
+                          <a:off x="0" y="0"/>
+                          <a:ext cx="7377032" cy="10546597"/>
+                        </a:xfrm>
+                        <a:prstGeom prst="rect">
+                          <a:avLst/>
+                        </a:prstGeom>
+                        <a:noFill/>
+                        <a:ln>
+                          <a:solidFill>
+                            <a:schemeClr val="accent5">
+                              <a:lumMod val="50000"/>
+                            </a:schemeClr>
+                          </a:solidFill>
+                        </a:ln>
+                      </wps:spPr>
+                      <wps:style>
+                        <a:lnRef idx="2">
+                          <a:schemeClr val="accent1">
+                            <a:shade val="15000"/>
+                          </a:schemeClr>
+                        </a:lnRef>
+                        <a:fillRef idx="1">
+                          <a:schemeClr val="accent1"/>
+                        </a:fillRef>
+                        <a:effectRef idx="0">
+                          <a:schemeClr val="accent1"/>
+                        </a:effectRef>
+                        <a:fontRef idx="minor">
+                          <a:schemeClr val="lt1"/>
+                        </a:fontRef>
+                      </wps:style>
+                      <wps:bodyPr rot="0" spcFirstLastPara="0" vertOverflow="overflow" horzOverflow="overflow" vert="horz" wrap="square" lIns="91440" tIns="45720" rIns="91440" bIns="45720" numCol="1" spcCol="0" rtlCol="0" fromWordArt="0" anchor="ctr" anchorCtr="0" forceAA="0" compatLnSpc="1">
+                        <a:prstTxWarp prst="textNoShape">
+                          <a:avLst/>
+                        </a:prstTxWarp>
+                        <a:noAutofit/>
+                      </wps:bodyPr>
+                    </wps:wsp>
+                  </a:graphicData>
+                </a:graphic>
+                <wp14:sizeRelH relativeFrom="margin">
+                  <wp14:pctWidth>0</wp14:pctWidth>
+                </wp14:sizeRelH>
+                <wp14:sizeRelV relativeFrom="margin">
+                  <wp14:pctHeight>0</wp14:pctHeight>
+                </wp14:sizeRelV>
+              </wp:anchor>
+            </w:drawing>
+          </mc:Choice>
+          <mc:Fallback>
+            <w:pict>
+              <v:rect w14:anchorId="2F0E2EEB" id="Rectangle 44" o:spid="_x0000_s1026" style="position:absolute;margin-left:4.9pt;margin-top:-8.7pt;width:580.85pt;height:830.45pt;z-index:251702272;visibility:visible;mso-wrap-style:square;mso-width-percent:0;mso-height-percent:0;mso-wrap-distance-left:9pt;mso-wrap-distance-top:0;mso-wrap-distance-right:9pt;mso-wrap-distance-bottom:0;mso-position-horizontal:absolute;mso-position-horizontal-relative:page;mso-position-vertical:absolute;mso-position-vertical-relative:text;mso-width-percent:0;mso-height-percent:0;mso-width-relative:margin;mso-height-relative:margin;v-text-anchor:middle" o:gfxdata="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" filled="f" strokecolor="#1f4d78 [1608]" strokeweight="1pt">
+                <w10:wrap anchorx="page"/>
+              </v:rect>
+            </w:pict>
+          </mc:Fallback>
+        </mc:AlternateContent>
+      </w:r>
       <w:r>
         <w:rPr>
           <w:rFonts w:ascii="Aptos Display" w:hAnsi="Aptos Display"/>
@@ -5700,7 +5713,296 @@
           <w:sz w:val="26"/>
           <w:szCs w:val="26"/>
         </w:rPr>
-        <w:t xml:space="preserve">                       </w:t>
+        <w:t xml:space="preserve">            </w:t>
+      </w:r>
+      <w:r>
+        <w:rPr>
+          <w:rFonts w:ascii="Aptos Display" w:hAnsi="Aptos Display"/>
+          <w:b/>
+          <w:bCs/>
+          <w:color w:val="1F4E79" w:themeColor="accent5" w:themeShade="80"/>
+          <w:sz w:val="26"/>
+          <w:szCs w:val="26"/>
+        </w:rPr>
+        <w:t xml:space="preserve">8. </w:t>
+      </w:r>
+      <w:r>
+        <w:rPr>
+          <w:rFonts w:ascii="Aptos Display" w:hAnsi="Aptos Display"/>
+          <w:b/>
+          <w:bCs/>
+          <w:color w:val="1F4E79" w:themeColor="accent5" w:themeShade="80"/>
+          <w:sz w:val="26"/>
+          <w:szCs w:val="26"/>
+        </w:rPr>
+        <w:t>Hypothesis</w:t>
+      </w:r>
+    </w:p>
+    <w:p>
+      <w:pPr>
+        <w:rPr>
+          <w:rFonts w:ascii="Aptos Display" w:hAnsi="Aptos Display"/>
+          <w:b/>
+          <w:bCs/>
+          <w:color w:val="000000" w:themeColor="text1"/>
+          <w:sz w:val="20"/>
+          <w:szCs w:val="20"/>
+        </w:rPr>
+      </w:pPr>
+      <w:r>
+        <w:rPr>
+          <w:rFonts w:ascii="Aptos Display" w:hAnsi="Aptos Display"/>
+          <w:b/>
+          <w:bCs/>
+          <w:color w:val="000000" w:themeColor="text1"/>
+          <w:sz w:val="20"/>
+          <w:szCs w:val="20"/>
+        </w:rPr>
+        <w:t>Phase 3 – Hypothesis Formulation and Analytical Techniques</w:t>
+      </w:r>
+    </w:p>
+    <w:p>
+      <w:pPr>
+        <w:rPr>
+          <w:rFonts w:ascii="Aptos Display" w:hAnsi="Aptos Display"/>
+          <w:b/>
+          <w:bCs/>
+          <w:color w:val="000000" w:themeColor="text1"/>
+          <w:sz w:val="20"/>
+          <w:szCs w:val="20"/>
+        </w:rPr>
+      </w:pPr>
+      <w:r>
+        <w:rPr>
+          <w:rFonts w:ascii="Aptos Display" w:hAnsi="Aptos Display"/>
+          <w:b/>
+          <w:bCs/>
+          <w:color w:val="000000" w:themeColor="text1"/>
+          <w:sz w:val="20"/>
+          <w:szCs w:val="20"/>
+        </w:rPr>
+        <w:t>1. Customer Purchasing Behaviour — T-Test</w:t>
+      </w:r>
+    </w:p>
+    <w:p>
+      <w:pPr>
+        <w:rPr>
+          <w:rFonts w:ascii="Aptos Display" w:hAnsi="Aptos Display"/>
+          <w:b/>
+          <w:bCs/>
+          <w:color w:val="000000" w:themeColor="text1"/>
+          <w:sz w:val="20"/>
+          <w:szCs w:val="20"/>
+        </w:rPr>
+      </w:pPr>
+      <w:r>
+        <w:rPr>
+          <w:rFonts w:ascii="Aptos Display" w:hAnsi="Aptos Display"/>
+          <w:b/>
+          <w:bCs/>
+          <w:color w:val="000000" w:themeColor="text1"/>
+          <w:sz w:val="20"/>
+          <w:szCs w:val="20"/>
+        </w:rPr>
+        <w:t>H₀: There is no significant difference in the average purchase amount between New and Returning customers.</w:t>
+      </w:r>
+      <w:r>
+        <w:rPr>
+          <w:rFonts w:ascii="Aptos Display" w:hAnsi="Aptos Display"/>
+          <w:b/>
+          <w:bCs/>
+          <w:color w:val="000000" w:themeColor="text1"/>
+          <w:sz w:val="20"/>
+          <w:szCs w:val="20"/>
+        </w:rPr>
+        <w:br/>
+        <w:t>H₁: There is a significant difference in the average purchase amount between New and Returning customers.</w:t>
+      </w:r>
+      <w:r>
+        <w:rPr>
+          <w:rFonts w:ascii="Aptos Display" w:hAnsi="Aptos Display"/>
+          <w:b/>
+          <w:bCs/>
+          <w:color w:val="000000" w:themeColor="text1"/>
+          <w:sz w:val="20"/>
+          <w:szCs w:val="20"/>
+        </w:rPr>
+        <w:br/>
+        <w:t>Technique: Independent Two-Sample T-Test</w:t>
+      </w:r>
+    </w:p>
+    <w:p>
+      <w:pPr>
+        <w:rPr>
+          <w:rFonts w:ascii="Aptos Display" w:hAnsi="Aptos Display"/>
+          <w:b/>
+          <w:bCs/>
+          <w:color w:val="000000" w:themeColor="text1"/>
+          <w:sz w:val="20"/>
+          <w:szCs w:val="20"/>
+        </w:rPr>
+      </w:pPr>
+      <w:r>
+        <w:rPr>
+          <w:rFonts w:ascii="Aptos Display" w:hAnsi="Aptos Display"/>
+          <w:b/>
+          <w:bCs/>
+          <w:color w:val="000000" w:themeColor="text1"/>
+          <w:sz w:val="20"/>
+          <w:szCs w:val="20"/>
+        </w:rPr>
+        <w:t>2. Customer Conversion and Retention — K-Means Clustering</w:t>
+      </w:r>
+    </w:p>
+    <w:p>
+      <w:pPr>
+        <w:rPr>
+          <w:rFonts w:ascii="Aptos Display" w:hAnsi="Aptos Display"/>
+          <w:b/>
+          <w:bCs/>
+          <w:color w:val="000000" w:themeColor="text1"/>
+          <w:sz w:val="20"/>
+          <w:szCs w:val="20"/>
+        </w:rPr>
+      </w:pPr>
+      <w:r>
+        <w:rPr>
+          <w:rFonts w:ascii="Aptos Display" w:hAnsi="Aptos Display"/>
+          <w:b/>
+          <w:bCs/>
+          <w:color w:val="000000" w:themeColor="text1"/>
+          <w:sz w:val="20"/>
+          <w:szCs w:val="20"/>
+        </w:rPr>
+        <w:t>Objective: To segment customers based on purchasing behaviour and identify opportunities to improve customer conversion and retention.</w:t>
+      </w:r>
+      <w:r>
+        <w:rPr>
+          <w:rFonts w:ascii="Aptos Display" w:hAnsi="Aptos Display"/>
+          <w:b/>
+          <w:bCs/>
+          <w:color w:val="000000" w:themeColor="text1"/>
+          <w:sz w:val="20"/>
+          <w:szCs w:val="20"/>
+        </w:rPr>
+        <w:br/>
+        <w:t>Technique: K-Means Clustering</w:t>
+      </w:r>
+    </w:p>
+    <w:p>
+      <w:pPr>
+        <w:rPr>
+          <w:rFonts w:ascii="Aptos Display" w:hAnsi="Aptos Display"/>
+          <w:b/>
+          <w:bCs/>
+          <w:color w:val="000000" w:themeColor="text1"/>
+          <w:sz w:val="20"/>
+          <w:szCs w:val="20"/>
+        </w:rPr>
+      </w:pPr>
+      <w:r>
+        <w:rPr>
+          <w:rFonts w:ascii="Aptos Display" w:hAnsi="Aptos Display"/>
+          <w:b/>
+          <w:bCs/>
+          <w:color w:val="000000" w:themeColor="text1"/>
+          <w:sz w:val="20"/>
+          <w:szCs w:val="20"/>
+        </w:rPr>
+        <w:t>3. Impact of Customer Reviews on Sales — Multiple Linear Regression</w:t>
+      </w:r>
+    </w:p>
+    <w:p>
+      <w:pPr>
+        <w:rPr>
+          <w:rFonts w:ascii="Aptos Display" w:hAnsi="Aptos Display"/>
+          <w:b/>
+          <w:bCs/>
+          <w:color w:val="000000" w:themeColor="text1"/>
+          <w:sz w:val="20"/>
+          <w:szCs w:val="20"/>
+        </w:rPr>
+      </w:pPr>
+      <w:r>
+        <w:rPr>
+          <w:rFonts w:ascii="Aptos Display" w:hAnsi="Aptos Display"/>
+          <w:b/>
+          <w:bCs/>
+          <w:color w:val="000000" w:themeColor="text1"/>
+          <w:sz w:val="20"/>
+          <w:szCs w:val="20"/>
+        </w:rPr>
+        <w:t>Objective: To examine the relationship between customer review scores and sales while considering other relevant factors.</w:t>
+      </w:r>
+      <w:r>
+        <w:rPr>
+          <w:rFonts w:ascii="Aptos Display" w:hAnsi="Aptos Display"/>
+          <w:b/>
+          <w:bCs/>
+          <w:color w:val="000000" w:themeColor="text1"/>
+          <w:sz w:val="20"/>
+          <w:szCs w:val="20"/>
+        </w:rPr>
+        <w:br/>
+        <w:t>Technique: Multiple Linear Regression (MLR)</w:t>
+      </w:r>
+    </w:p>
+    <w:p>
+      <w:pPr>
+        <w:rPr>
+          <w:rFonts w:ascii="Aptos Display" w:hAnsi="Aptos Display"/>
+          <w:b/>
+          <w:bCs/>
+          <w:color w:val="000000" w:themeColor="text1"/>
+          <w:sz w:val="20"/>
+          <w:szCs w:val="20"/>
+        </w:rPr>
+      </w:pPr>
+      <w:r>
+        <w:rPr>
+          <w:rFonts w:ascii="Aptos Display" w:hAnsi="Aptos Display"/>
+          <w:b/>
+          <w:bCs/>
+          <w:color w:val="000000" w:themeColor="text1"/>
+          <w:sz w:val="20"/>
+          <w:szCs w:val="20"/>
+        </w:rPr>
+        <w:t>4. Sampling Technique</w:t>
+      </w:r>
+    </w:p>
+    <w:p>
+      <w:pPr>
+        <w:rPr>
+          <w:rFonts w:ascii="Aptos Display" w:hAnsi="Aptos Display"/>
+          <w:b/>
+          <w:bCs/>
+          <w:color w:val="000000" w:themeColor="text1"/>
+          <w:sz w:val="20"/>
+          <w:szCs w:val="20"/>
+        </w:rPr>
+      </w:pPr>
+      <w:r>
+        <w:rPr>
+          <w:rFonts w:ascii="Aptos Display" w:hAnsi="Aptos Display"/>
+          <w:b/>
+          <w:bCs/>
+          <w:color w:val="000000" w:themeColor="text1"/>
+          <w:sz w:val="20"/>
+          <w:szCs w:val="20"/>
+        </w:rPr>
+        <w:t>Technique: Stratified Sampling</w:t>
+      </w:r>
+      <w:r>
+        <w:rPr>
+          <w:rFonts w:ascii="Aptos Display" w:hAnsi="Aptos Display"/>
+          <w:b/>
+          <w:bCs/>
+          <w:color w:val="000000" w:themeColor="text1"/>
+          <w:sz w:val="20"/>
+          <w:szCs w:val="20"/>
+        </w:rPr>
+        <w:br/>
+        <w:t>Strata: New, Returning, and Loyal customers.</w:t>
       </w:r>
     </w:p>
     <w:p>
@@ -5726,7 +6028,7 @@
 </file>
 
 <file path=word/numbering.xml><?xml version="1.0" encoding="utf-8"?>
-<w:numbering xmlns:wpc="http://schemas.microsoft.com/office/word/2010/wordprocessingCanvas" xmlns:cx="http://schemas.microsoft.com/office/drawing/2014/chartex" xmlns:cx1="http://schemas.microsoft.com/office/drawing/2015/9/8/chartex" xmlns:cx2="http://schemas.microsoft.com/office/drawing/2015/10/21/chartex" xmlns:cx3="http://schemas.microsoft.com/office/drawing/2016/5/9/chartex" xmlns:cx4="http://schemas.microsoft.com/office/drawing/2016/5/10/chartex" xmlns:cx5="http://schemas.microsoft.com/office/drawing/2016/5/11/chartex" xmlns:cx6="http://schemas.microsoft.com/office/drawing/2016/5/12/chartex" xmlns:cx7="http://schemas.microsoft.com/office/drawing/2016/5/13/chartex" xmlns:cx8="http://schemas.microsoft.com/office/drawing/2016/5/14/chartex" xmlns:mc="http://schemas.openxmlformats.org/markup-compatibility/2006" xmlns:aink="http://schemas.microsoft.com/office/drawing/2016/ink" xmlns:am3d="http://schemas.microsoft.com/office/drawing/2017/model3d" xmlns:o="urn:schemas-microsoft-com:office:office" xmlns:oel="http://schemas.microsoft.com/office/2019/extlst" xmlns:r="http://schemas.openxmlformats.org/officeDocument/2006/relationships" xmlns:m="http://schemas.openxmlformats.org/officeDocument/2006/math" xmlns:v="urn:schemas-microsoft-com:vml" xmlns:wp14="http://schemas.microsoft.com/office/word/2010/wordprocessingDrawing" xmlns:wp="http://schemas.openxmlformats.org/drawingml/2006/wordprocessingDrawing" xmlns:w10="urn:schemas-microsoft-com:office:word" xmlns:w="http://schemas.openxmlformats.org/wordprocessingml/2006/main" xmlns:w14="http://schemas.microsoft.com/office/word/2010/wordml" xmlns:w15="http://schemas.microsoft.com/office/word/2012/wordml" xmlns:w16cei="http://schemas.microsoft.com/office/word/2026/wordml/cei" xmlns:w16cex="http://schemas.microsoft.com/office/word/2018/wordml/cex" xmlns:w16cid="http://schemas.microsoft.com/office/word/2016/wordml/cid" xmlns:w16="http://schemas.microsoft.com/office/word/2018/wordml" xmlns:w16du="http://schemas.microsoft.com/office/word/2023/wordml/word16du" xmlns:w16sdtdh="http://schemas.microsoft.com/office/word/2020/wordml/sdtdatahash" xmlns:w16sdtfl="http://schemas.microsoft.com/office/word/2024/wordml/sdtformatlock" xmlns:w16se="http://schemas.microsoft.com/office/word/2015/wordml/symex" xmlns:wpg="http://schemas.microsoft.com/office/word/2010/wordprocessingGroup" xmlns:wpi="http://schemas.microsoft.com/office/word/2010/wordprocessingInk" xmlns:wne="http://schemas.microsoft.com/office/word/2006/wordml" xmlns:wps="http://schemas.microsoft.com/office/word/2010/wordprocessingShape" mc:Ignorable="w14 w15 w16se w16cid w16 w16cex w16sdtdh w16sdtfl w16du wp14">
+<w:numbering xmlns:wpc="http://schemas.microsoft.com/office/word/2010/wordprocessingCanvas" xmlns:cx="http://schemas.microsoft.com/office/drawing/2014/chartex" xmlns:cx1="http://schemas.microsoft.com/office/drawing/2015/9/8/chartex" xmlns:cx2="http://schemas.microsoft.com/office/drawing/2015/10/21/chartex" xmlns:cx3="http://schemas.microsoft.com/office/drawing/2016/5/9/chartex" xmlns:cx4="http://schemas.microsoft.com/office/drawing/2016/5/10/chartex" xmlns:cx5="http://schemas.microsoft.com/office/drawing/2016/5/11/chartex" xmlns:cx6="http://schemas.microsoft.com/office/drawing/2016/5/12/chartex" xmlns:cx7="http://schemas.microsoft.com/office/drawing/2016/5/13/chartex" xmlns:cx8="http://schemas.microsoft.com/office/drawing/2016/5/14/chartex" xmlns:mc="http://schemas.openxmlformats.org/markup-compatibility/2006" xmlns:aink="http://schemas.microsoft.com/office/drawing/2016/ink" xmlns:am3d="http://schemas.microsoft.com/office/drawing/2017/model3d" xmlns:o="urn:schemas-microsoft-com:office:office" xmlns:oel="http://schemas.microsoft.com/office/2019/extlst" xmlns:r="http://schemas.openxmlformats.org/officeDocument/2006/relationships" xmlns:m="http://schemas.openxmlformats.org/officeDocument/2006/math" xmlns:v="urn:schemas-microsoft-com:vml" xmlns:wp14="http://schemas.microsoft.com/office/word/2010/wordprocessingDrawing" xmlns:wp="http://schemas.openxmlformats.org/drawingml/2006/wordprocessingDrawing" xmlns:w10="urn:schemas-microsoft-com:office:word" xmlns:w="http://schemas.openxmlformats.org/wordprocessingml/2006/main" xmlns:w14="http://schemas.microsoft.com/office/word/2010/wordml" xmlns:w15="http://schemas.microsoft.com/office/word/2012/wordml" xmlns:w16cex="http://schemas.microsoft.com/office/word/2018/wordml/cex" xmlns:w16cid="http://schemas.microsoft.com/office/word/2016/wordml/cid" xmlns:w16="http://schemas.microsoft.com/office/word/2018/wordml" xmlns:w16du="http://schemas.microsoft.com/office/word/2023/wordml/word16du" xmlns:w16sdtdh="http://schemas.microsoft.com/office/word/2020/wordml/sdtdatahash" xmlns:w16sdtfl="http://schemas.microsoft.com/office/word/2024/wordml/sdtformatlock" xmlns:w16se="http://schemas.microsoft.com/office/word/2015/wordml/symex" xmlns:wpg="http://schemas.microsoft.com/office/word/2010/wordprocessingGroup" xmlns:wpi="http://schemas.microsoft.com/office/word/2010/wordprocessingInk" xmlns:wne="http://schemas.microsoft.com/office/word/2006/wordml" xmlns:wps="http://schemas.microsoft.com/office/word/2010/wordprocessingShape" mc:Ignorable="w14 w15 w16se w16cid w16 w16cex w16sdtdh w16sdtfl w16du wp14">
   <w:abstractNum w:abstractNumId="0" w15:restartNumberingAfterBreak="0">
     <w:nsid w:val="17DA2E51"/>
     <w:multiLevelType w:val="hybridMultilevel"/>
@@ -6072,6 +6374,268 @@
       </w:rPr>
     </w:lvl>
   </w:abstractNum>
+  <w:abstractNum w:abstractNumId="3" w15:restartNumberingAfterBreak="0">
+    <w:nsid w:val="621C1187"/>
+    <w:multiLevelType w:val="hybridMultilevel"/>
+    <w:tmpl w:val="555C3ADC"/>
+    <w:lvl w:ilvl="0" w:tplc="40090001">
+      <w:start w:val="1"/>
+      <w:numFmt w:val="bullet"/>
+      <w:lvlText w:val=""/>
+      <w:lvlJc w:val="left"/>
+      <w:pPr>
+        <w:ind w:left="720" w:hanging="360"/>
+      </w:pPr>
+      <w:rPr>
+        <w:rFonts w:ascii="Symbol" w:hAnsi="Symbol" w:hint="default"/>
+      </w:rPr>
+    </w:lvl>
+    <w:lvl w:ilvl="1" w:tplc="40090003" w:tentative="1">
+      <w:start w:val="1"/>
+      <w:numFmt w:val="bullet"/>
+      <w:lvlText w:val="o"/>
+      <w:lvlJc w:val="left"/>
+      <w:pPr>
+        <w:ind w:left="1440" w:hanging="360"/>
+      </w:pPr>
+      <w:rPr>
+        <w:rFonts w:ascii="Courier New" w:hAnsi="Courier New" w:cs="Courier New" w:hint="default"/>
+      </w:rPr>
+    </w:lvl>
+    <w:lvl w:ilvl="2" w:tplc="40090005" w:tentative="1">
+      <w:start w:val="1"/>
+      <w:numFmt w:val="bullet"/>
+      <w:lvlText w:val=""/>
+      <w:lvlJc w:val="left"/>
+      <w:pPr>
+        <w:ind w:left="2160" w:hanging="360"/>
+      </w:pPr>
+      <w:rPr>
+        <w:rFonts w:ascii="Wingdings" w:hAnsi="Wingdings" w:hint="default"/>
+      </w:rPr>
+    </w:lvl>
+    <w:lvl w:ilvl="3" w:tplc="40090001" w:tentative="1">
+      <w:start w:val="1"/>
+      <w:numFmt w:val="bullet"/>
+      <w:lvlText w:val=""/>
+      <w:lvlJc w:val="left"/>
+      <w:pPr>
+        <w:ind w:left="2880" w:hanging="360"/>
+      </w:pPr>
+      <w:rPr>
+        <w:rFonts w:ascii="Symbol" w:hAnsi="Symbol" w:hint="default"/>
+      </w:rPr>
+    </w:lvl>
+    <w:lvl w:ilvl="4" w:tplc="40090003" w:tentative="1">
+      <w:start w:val="1"/>
+      <w:numFmt w:val="bullet"/>
+      <w:lvlText w:val="o"/>
+      <w:lvlJc w:val="left"/>
+      <w:pPr>
+        <w:ind w:left="3600" w:hanging="360"/>
+      </w:pPr>
+      <w:rPr>
+        <w:rFonts w:ascii="Courier New" w:hAnsi="Courier New" w:cs="Courier New" w:hint="default"/>
+      </w:rPr>
+    </w:lvl>
+    <w:lvl w:ilvl="5" w:tplc="40090005" w:tentative="1">
+      <w:start w:val="1"/>
+      <w:numFmt w:val="bullet"/>
+      <w:lvlText w:val=""/>
+      <w:lvlJc w:val="left"/>
+      <w:pPr>
+        <w:ind w:left="4320" w:hanging="360"/>
+      </w:pPr>
+      <w:rPr>
+        <w:rFonts w:ascii="Wingdings" w:hAnsi="Wingdings" w:hint="default"/>
+      </w:rPr>
+    </w:lvl>
+    <w:lvl w:ilvl="6" w:tplc="40090001" w:tentative="1">
+      <w:start w:val="1"/>
+      <w:numFmt w:val="bullet"/>
+      <w:lvlText w:val=""/>
+      <w:lvlJc w:val="left"/>
+      <w:pPr>
+        <w:ind w:left="5040" w:hanging="360"/>
+      </w:pPr>
+      <w:rPr>
+        <w:rFonts w:ascii="Symbol" w:hAnsi="Symbol" w:hint="default"/>
+      </w:rPr>
+    </w:lvl>
+    <w:lvl w:ilvl="7" w:tplc="40090003" w:tentative="1">
+      <w:start w:val="1"/>
+      <w:numFmt w:val="bullet"/>
+      <w:lvlText w:val="o"/>
+      <w:lvlJc w:val="left"/>
+      <w:pPr>
+        <w:ind w:left="5760" w:hanging="360"/>
+      </w:pPr>
+      <w:rPr>
+        <w:rFonts w:ascii="Courier New" w:hAnsi="Courier New" w:cs="Courier New" w:hint="default"/>
+      </w:rPr>
+    </w:lvl>
+    <w:lvl w:ilvl="8" w:tplc="40090005" w:tentative="1">
+      <w:start w:val="1"/>
+      <w:numFmt w:val="bullet"/>
+      <w:lvlText w:val=""/>
+      <w:lvlJc w:val="left"/>
+      <w:pPr>
+        <w:ind w:left="6480" w:hanging="360"/>
+      </w:pPr>
+      <w:rPr>
+        <w:rFonts w:ascii="Wingdings" w:hAnsi="Wingdings" w:hint="default"/>
+      </w:rPr>
+    </w:lvl>
+  </w:abstractNum>
+  <w:abstractNum w:abstractNumId="4" w15:restartNumberingAfterBreak="0">
+    <w:nsid w:val="68E144D8"/>
+    <w:multiLevelType w:val="multilevel"/>
+    <w:tmpl w:val="C354F62C"/>
+    <w:lvl w:ilvl="0">
+      <w:start w:val="1"/>
+      <w:numFmt w:val="bullet"/>
+      <w:lvlText w:val=""/>
+      <w:lvlJc w:val="left"/>
+      <w:pPr>
+        <w:tabs>
+          <w:tab w:val="num" w:pos="720"/>
+        </w:tabs>
+        <w:ind w:left="720" w:hanging="360"/>
+      </w:pPr>
+      <w:rPr>
+        <w:rFonts w:ascii="Symbol" w:hAnsi="Symbol" w:hint="default"/>
+        <w:sz w:val="20"/>
+      </w:rPr>
+    </w:lvl>
+    <w:lvl w:ilvl="1">
+      <w:start w:val="1"/>
+      <w:numFmt w:val="bullet"/>
+      <w:lvlText w:val="o"/>
+      <w:lvlJc w:val="left"/>
+      <w:pPr>
+        <w:tabs>
+          <w:tab w:val="num" w:pos="1440"/>
+        </w:tabs>
+        <w:ind w:left="1440" w:hanging="360"/>
+      </w:pPr>
+      <w:rPr>
+        <w:rFonts w:ascii="Courier New" w:hAnsi="Courier New" w:hint="default"/>
+        <w:sz w:val="20"/>
+      </w:rPr>
+    </w:lvl>
+    <w:lvl w:ilvl="2" w:tentative="1">
+      <w:start w:val="1"/>
+      <w:numFmt w:val="bullet"/>
+      <w:lvlText w:val=""/>
+      <w:lvlJc w:val="left"/>
+      <w:pPr>
+        <w:tabs>
+          <w:tab w:val="num" w:pos="2160"/>
+        </w:tabs>
+        <w:ind w:left="2160" w:hanging="360"/>
+      </w:pPr>
+      <w:rPr>
+        <w:rFonts w:ascii="Wingdings" w:hAnsi="Wingdings" w:hint="default"/>
+        <w:sz w:val="20"/>
+      </w:rPr>
+    </w:lvl>
+    <w:lvl w:ilvl="3" w:tentative="1">
+      <w:start w:val="1"/>
+      <w:numFmt w:val="bullet"/>
+      <w:lvlText w:val=""/>
+      <w:lvlJc w:val="left"/>
+      <w:pPr>
+        <w:tabs>
+          <w:tab w:val="num" w:pos="2880"/>
+        </w:tabs>
+        <w:ind w:left="2880" w:hanging="360"/>
+      </w:pPr>
+      <w:rPr>
+        <w:rFonts w:ascii="Wingdings" w:hAnsi="Wingdings" w:hint="default"/>
+        <w:sz w:val="20"/>
+      </w:rPr>
+    </w:lvl>
+    <w:lvl w:ilvl="4" w:tentative="1">
+      <w:start w:val="1"/>
+      <w:numFmt w:val="bullet"/>
+      <w:lvlText w:val=""/>
+      <w:lvlJc w:val="left"/>
+      <w:pPr>
+        <w:tabs>
+          <w:tab w:val="num" w:pos="3600"/>
+        </w:tabs>
+        <w:ind w:left="3600" w:hanging="360"/>
+      </w:pPr>
+      <w:rPr>
+        <w:rFonts w:ascii="Wingdings" w:hAnsi="Wingdings" w:hint="default"/>
+        <w:sz w:val="20"/>
+      </w:rPr>
+    </w:lvl>
+    <w:lvl w:ilvl="5" w:tentative="1">
+      <w:start w:val="1"/>
+      <w:numFmt w:val="bullet"/>
+      <w:lvlText w:val=""/>
+      <w:lvlJc w:val="left"/>
+      <w:pPr>
+        <w:tabs>
+          <w:tab w:val="num" w:pos="4320"/>
+        </w:tabs>
+        <w:ind w:left="4320" w:hanging="360"/>
+      </w:pPr>
+      <w:rPr>
+        <w:rFonts w:ascii="Wingdings" w:hAnsi="Wingdings" w:hint="default"/>
+        <w:sz w:val="20"/>
+      </w:rPr>
+    </w:lvl>
+    <w:lvl w:ilvl="6" w:tentative="1">
+      <w:start w:val="1"/>
+      <w:numFmt w:val="bullet"/>
+      <w:lvlText w:val=""/>
+      <w:lvlJc w:val="left"/>
+      <w:pPr>
+        <w:tabs>
+          <w:tab w:val="num" w:pos="5040"/>
+        </w:tabs>
+        <w:ind w:left="5040" w:hanging="360"/>
+      </w:pPr>
+      <w:rPr>
+        <w:rFonts w:ascii="Wingdings" w:hAnsi="Wingdings" w:hint="default"/>
+        <w:sz w:val="20"/>
+      </w:rPr>
+    </w:lvl>
+    <w:lvl w:ilvl="7" w:tentative="1">
+      <w:start w:val="1"/>
+      <w:numFmt w:val="bullet"/>
+      <w:lvlText w:val=""/>
+      <w:lvlJc w:val="left"/>
+      <w:pPr>
+        <w:tabs>
+          <w:tab w:val="num" w:pos="5760"/>
+        </w:tabs>
+        <w:ind w:left="5760" w:hanging="360"/>
+      </w:pPr>
+      <w:rPr>
+        <w:rFonts w:ascii="Wingdings" w:hAnsi="Wingdings" w:hint="default"/>
+        <w:sz w:val="20"/>
+      </w:rPr>
+    </w:lvl>
+    <w:lvl w:ilvl="8" w:tentative="1">
+      <w:start w:val="1"/>
+      <w:numFmt w:val="bullet"/>
+      <w:lvlText w:val=""/>
+      <w:lvlJc w:val="left"/>
+      <w:pPr>
+        <w:tabs>
+          <w:tab w:val="num" w:pos="6480"/>
+        </w:tabs>
+        <w:ind w:left="6480" w:hanging="360"/>
+      </w:pPr>
+      <w:rPr>
+        <w:rFonts w:ascii="Wingdings" w:hAnsi="Wingdings" w:hint="default"/>
+        <w:sz w:val="20"/>
+      </w:rPr>
+    </w:lvl>
+  </w:abstractNum>
   <w:num w:numId="1" w16cid:durableId="608972721">
     <w:abstractNumId w:val="2"/>
   </w:num>
@@ -6080,6 +6644,12 @@
   </w:num>
   <w:num w:numId="3" w16cid:durableId="957024698">
     <w:abstractNumId w:val="1"/>
+  </w:num>
+  <w:num w:numId="4" w16cid:durableId="2012681646">
+    <w:abstractNumId w:val="3"/>
+  </w:num>
+  <w:num w:numId="5" w16cid:durableId="1299187959">
+    <w:abstractNumId w:val="4"/>
   </w:num>
 </w:numbering>
 </file>

</xml_diff>

<commit_message>
Updated Phase 4 dashboard and added Phase 5
</commit_message>
<xml_diff>
--- a/E-Commerce Sales Analysis.docx
+++ b/E-Commerce Sales Analysis.docx
@@ -5986,11 +5986,76 @@
           <w:rFonts w:ascii="Aptos Display" w:hAnsi="Aptos Display"/>
           <w:b/>
           <w:bCs/>
+          <w:noProof/>
           <w:color w:val="000000" w:themeColor="text1"/>
           <w:sz w:val="20"/>
           <w:szCs w:val="20"/>
         </w:rPr>
-        <w:t>Technique: Stratified Sampling</w:t>
+        <mc:AlternateContent>
+          <mc:Choice Requires="wps">
+            <w:drawing>
+              <wp:anchor distT="0" distB="0" distL="114300" distR="114300" simplePos="0" relativeHeight="251704320" behindDoc="0" locked="0" layoutInCell="1" allowOverlap="1" wp14:anchorId="35EC3854" wp14:editId="1C50D8C2">
+                <wp:simplePos x="0" y="0"/>
+                <wp:positionH relativeFrom="column">
+                  <wp:posOffset>-105130</wp:posOffset>
+                </wp:positionH>
+                <wp:positionV relativeFrom="paragraph">
+                  <wp:posOffset>382378</wp:posOffset>
+                </wp:positionV>
+                <wp:extent cx="7345798" cy="38745"/>
+                <wp:effectExtent l="0" t="0" r="26670" b="37465"/>
+                <wp:wrapNone/>
+                <wp:docPr id="1160905976" name="Straight Connector 6"/>
+                <wp:cNvGraphicFramePr/>
+                <a:graphic xmlns:a="http://schemas.openxmlformats.org/drawingml/2006/main">
+                  <a:graphicData uri="http://schemas.microsoft.com/office/word/2010/wordprocessingShape">
+                    <wps:wsp>
+                      <wps:cNvCnPr/>
+                      <wps:spPr>
+                        <a:xfrm>
+                          <a:off x="0" y="0"/>
+                          <a:ext cx="7345798" cy="38745"/>
+                        </a:xfrm>
+                        <a:prstGeom prst="line">
+                          <a:avLst/>
+                        </a:prstGeom>
+                        <a:ln>
+                          <a:solidFill>
+                            <a:schemeClr val="accent1">
+                              <a:lumMod val="50000"/>
+                            </a:schemeClr>
+                          </a:solidFill>
+                        </a:ln>
+                      </wps:spPr>
+                      <wps:style>
+                        <a:lnRef idx="1">
+                          <a:schemeClr val="accent1"/>
+                        </a:lnRef>
+                        <a:fillRef idx="0">
+                          <a:schemeClr val="accent1"/>
+                        </a:fillRef>
+                        <a:effectRef idx="0">
+                          <a:schemeClr val="accent1"/>
+                        </a:effectRef>
+                        <a:fontRef idx="minor">
+                          <a:schemeClr val="tx1"/>
+                        </a:fontRef>
+                      </wps:style>
+                      <wps:bodyPr/>
+                    </wps:wsp>
+                  </a:graphicData>
+                </a:graphic>
+              </wp:anchor>
+            </w:drawing>
+          </mc:Choice>
+          <mc:Fallback>
+            <w:pict>
+              <v:line w14:anchorId="37BAD245" id="Straight Connector 6" o:spid="_x0000_s1026" style="position:absolute;z-index:251704320;visibility:visible;mso-wrap-style:square;mso-wrap-distance-left:9pt;mso-wrap-distance-top:0;mso-wrap-distance-right:9pt;mso-wrap-distance-bottom:0;mso-position-horizontal:absolute;mso-position-horizontal-relative:text;mso-position-vertical:absolute;mso-position-vertical-relative:text" from="-8.3pt,30.1pt" to="570.1pt,33.15pt" o:gfxdata="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" strokecolor="#1f3763 [1604]" strokeweight=".5pt">
+                <v:stroke joinstyle="miter"/>
+              </v:line>
+            </w:pict>
+          </mc:Fallback>
+        </mc:AlternateContent>
       </w:r>
       <w:r>
         <w:rPr>
@@ -6001,6 +6066,17 @@
           <w:sz w:val="20"/>
           <w:szCs w:val="20"/>
         </w:rPr>
+        <w:t>Technique: Stratified Sampling</w:t>
+      </w:r>
+      <w:r>
+        <w:rPr>
+          <w:rFonts w:ascii="Aptos Display" w:hAnsi="Aptos Display"/>
+          <w:b/>
+          <w:bCs/>
+          <w:color w:val="000000" w:themeColor="text1"/>
+          <w:sz w:val="20"/>
+          <w:szCs w:val="20"/>
+        </w:rPr>
         <w:br/>
         <w:t>Strata: New, Returning, and Loyal customers.</w:t>
       </w:r>
@@ -6014,6 +6090,191 @@
           <w:color w:val="1F4E79" w:themeColor="accent5" w:themeShade="80"/>
           <w:sz w:val="26"/>
           <w:szCs w:val="26"/>
+        </w:rPr>
+      </w:pPr>
+      <w:r>
+        <w:rPr>
+          <w:rFonts w:ascii="Aptos Display" w:hAnsi="Aptos Display"/>
+          <w:b/>
+          <w:bCs/>
+          <w:color w:val="1F4E79" w:themeColor="accent5" w:themeShade="80"/>
+          <w:sz w:val="26"/>
+          <w:szCs w:val="26"/>
+        </w:rPr>
+        <w:t>Phase 4: Excel Analysis &amp; Dashboard</w:t>
+      </w:r>
+    </w:p>
+    <w:p>
+      <w:pPr>
+        <w:numPr>
+          <w:ilvl w:val="0"/>
+          <w:numId w:val="6"/>
+        </w:numPr>
+        <w:rPr>
+          <w:rFonts w:ascii="Aptos Display" w:hAnsi="Aptos Display"/>
+          <w:b/>
+          <w:bCs/>
+          <w:color w:val="000000" w:themeColor="text1"/>
+          <w:sz w:val="20"/>
+          <w:szCs w:val="20"/>
+        </w:rPr>
+      </w:pPr>
+      <w:r>
+        <w:rPr>
+          <w:rFonts w:ascii="Aptos Display" w:hAnsi="Aptos Display"/>
+          <w:b/>
+          <w:bCs/>
+          <w:color w:val="000000" w:themeColor="text1"/>
+          <w:sz w:val="20"/>
+          <w:szCs w:val="20"/>
+        </w:rPr>
+        <w:t xml:space="preserve">Excel Functions &amp; Data Preparation: Used XLOOKUP, IF, and conditional formulas for data validation and categorization. </w:t>
+      </w:r>
+    </w:p>
+    <w:p>
+      <w:pPr>
+        <w:numPr>
+          <w:ilvl w:val="0"/>
+          <w:numId w:val="6"/>
+        </w:numPr>
+        <w:rPr>
+          <w:rFonts w:ascii="Aptos Display" w:hAnsi="Aptos Display"/>
+          <w:b/>
+          <w:bCs/>
+          <w:color w:val="000000" w:themeColor="text1"/>
+          <w:sz w:val="20"/>
+          <w:szCs w:val="20"/>
+        </w:rPr>
+      </w:pPr>
+      <w:r>
+        <w:rPr>
+          <w:rFonts w:ascii="Aptos Display" w:hAnsi="Aptos Display"/>
+          <w:b/>
+          <w:bCs/>
+          <w:color w:val="000000" w:themeColor="text1"/>
+          <w:sz w:val="20"/>
+          <w:szCs w:val="20"/>
+        </w:rPr>
+        <w:t xml:space="preserve">Pivot Table Analysis: Created Pivot Tables to analyse sales by product category, customer segment, region, review score, and order status. </w:t>
+      </w:r>
+    </w:p>
+    <w:p>
+      <w:pPr>
+        <w:numPr>
+          <w:ilvl w:val="0"/>
+          <w:numId w:val="6"/>
+        </w:numPr>
+        <w:rPr>
+          <w:rFonts w:ascii="Aptos Display" w:hAnsi="Aptos Display"/>
+          <w:b/>
+          <w:bCs/>
+          <w:color w:val="000000" w:themeColor="text1"/>
+          <w:sz w:val="20"/>
+          <w:szCs w:val="20"/>
+        </w:rPr>
+      </w:pPr>
+      <w:r>
+        <w:rPr>
+          <w:rFonts w:ascii="Aptos Display" w:hAnsi="Aptos Display"/>
+          <w:b/>
+          <w:bCs/>
+          <w:color w:val="000000" w:themeColor="text1"/>
+          <w:sz w:val="20"/>
+          <w:szCs w:val="20"/>
+        </w:rPr>
+        <w:t xml:space="preserve">Pivot Chart Visualisation: Created column, bar, doughnut, stacked column, and line charts to visualize business trends and performance. </w:t>
+      </w:r>
+    </w:p>
+    <w:p>
+      <w:pPr>
+        <w:numPr>
+          <w:ilvl w:val="0"/>
+          <w:numId w:val="6"/>
+        </w:numPr>
+        <w:rPr>
+          <w:rFonts w:ascii="Aptos Display" w:hAnsi="Aptos Display"/>
+          <w:b/>
+          <w:bCs/>
+          <w:color w:val="000000" w:themeColor="text1"/>
+          <w:sz w:val="20"/>
+          <w:szCs w:val="20"/>
+        </w:rPr>
+      </w:pPr>
+      <w:r>
+        <w:rPr>
+          <w:rFonts w:ascii="Aptos Display" w:hAnsi="Aptos Display"/>
+          <w:b/>
+          <w:bCs/>
+          <w:color w:val="000000" w:themeColor="text1"/>
+          <w:sz w:val="20"/>
+          <w:szCs w:val="20"/>
+        </w:rPr>
+        <w:t xml:space="preserve">Descriptive Statistics: Calculated mean, median, minimum, maximum, standard deviation, skewness, and correlation to understand data distribution and relationships. </w:t>
+      </w:r>
+    </w:p>
+    <w:p>
+      <w:pPr>
+        <w:numPr>
+          <w:ilvl w:val="0"/>
+          <w:numId w:val="6"/>
+        </w:numPr>
+        <w:rPr>
+          <w:rFonts w:ascii="Aptos Display" w:hAnsi="Aptos Display"/>
+          <w:b/>
+          <w:bCs/>
+          <w:color w:val="000000" w:themeColor="text1"/>
+          <w:sz w:val="20"/>
+          <w:szCs w:val="20"/>
+        </w:rPr>
+      </w:pPr>
+      <w:r>
+        <w:rPr>
+          <w:rFonts w:ascii="Aptos Display" w:hAnsi="Aptos Display"/>
+          <w:b/>
+          <w:bCs/>
+          <w:color w:val="000000" w:themeColor="text1"/>
+          <w:sz w:val="20"/>
+          <w:szCs w:val="20"/>
+        </w:rPr>
+        <w:t xml:space="preserve">Outlier Analysis: Used Box &amp; Whisker charts to identify high-value outliers in Sales Amount, Unit Price, and Shipping Cost. </w:t>
+      </w:r>
+    </w:p>
+    <w:p>
+      <w:pPr>
+        <w:numPr>
+          <w:ilvl w:val="0"/>
+          <w:numId w:val="6"/>
+        </w:numPr>
+        <w:rPr>
+          <w:rFonts w:ascii="Aptos Display" w:hAnsi="Aptos Display"/>
+          <w:b/>
+          <w:bCs/>
+          <w:color w:val="000000" w:themeColor="text1"/>
+          <w:sz w:val="20"/>
+          <w:szCs w:val="20"/>
+        </w:rPr>
+      </w:pPr>
+      <w:r>
+        <w:rPr>
+          <w:rFonts w:ascii="Aptos Display" w:hAnsi="Aptos Display"/>
+          <w:b/>
+          <w:bCs/>
+          <w:color w:val="000000" w:themeColor="text1"/>
+          <w:sz w:val="20"/>
+          <w:szCs w:val="20"/>
+        </w:rPr>
+        <w:t xml:space="preserve">Dashboard Storytelling: Developed an interactive Excel dashboard with KPIs, charts, sales trends, and key business insights for stakeholder decision-making. </w:t>
+      </w:r>
+    </w:p>
+    <w:p>
+      <w:pPr>
+        <w:rPr>
+          <w:rFonts w:ascii="Aptos Display" w:hAnsi="Aptos Display"/>
+          <w:b/>
+          <w:bCs/>
+          <w:color w:val="000000" w:themeColor="text1"/>
+          <w:sz w:val="20"/>
+          <w:szCs w:val="20"/>
         </w:rPr>
       </w:pPr>
     </w:p>
@@ -6260,6 +6521,155 @@
     </w:lvl>
   </w:abstractNum>
   <w:abstractNum w:abstractNumId="2" w15:restartNumberingAfterBreak="0">
+    <w:nsid w:val="4F861293"/>
+    <w:multiLevelType w:val="multilevel"/>
+    <w:tmpl w:val="763E9EDA"/>
+    <w:lvl w:ilvl="0">
+      <w:start w:val="1"/>
+      <w:numFmt w:val="bullet"/>
+      <w:lvlText w:val=""/>
+      <w:lvlJc w:val="left"/>
+      <w:pPr>
+        <w:tabs>
+          <w:tab w:val="num" w:pos="720"/>
+        </w:tabs>
+        <w:ind w:left="720" w:hanging="360"/>
+      </w:pPr>
+      <w:rPr>
+        <w:rFonts w:ascii="Symbol" w:hAnsi="Symbol" w:hint="default"/>
+        <w:sz w:val="20"/>
+      </w:rPr>
+    </w:lvl>
+    <w:lvl w:ilvl="1" w:tentative="1">
+      <w:start w:val="1"/>
+      <w:numFmt w:val="bullet"/>
+      <w:lvlText w:val="o"/>
+      <w:lvlJc w:val="left"/>
+      <w:pPr>
+        <w:tabs>
+          <w:tab w:val="num" w:pos="1440"/>
+        </w:tabs>
+        <w:ind w:left="1440" w:hanging="360"/>
+      </w:pPr>
+      <w:rPr>
+        <w:rFonts w:ascii="Courier New" w:hAnsi="Courier New" w:hint="default"/>
+        <w:sz w:val="20"/>
+      </w:rPr>
+    </w:lvl>
+    <w:lvl w:ilvl="2" w:tentative="1">
+      <w:start w:val="1"/>
+      <w:numFmt w:val="bullet"/>
+      <w:lvlText w:val=""/>
+      <w:lvlJc w:val="left"/>
+      <w:pPr>
+        <w:tabs>
+          <w:tab w:val="num" w:pos="2160"/>
+        </w:tabs>
+        <w:ind w:left="2160" w:hanging="360"/>
+      </w:pPr>
+      <w:rPr>
+        <w:rFonts w:ascii="Wingdings" w:hAnsi="Wingdings" w:hint="default"/>
+        <w:sz w:val="20"/>
+      </w:rPr>
+    </w:lvl>
+    <w:lvl w:ilvl="3" w:tentative="1">
+      <w:start w:val="1"/>
+      <w:numFmt w:val="bullet"/>
+      <w:lvlText w:val=""/>
+      <w:lvlJc w:val="left"/>
+      <w:pPr>
+        <w:tabs>
+          <w:tab w:val="num" w:pos="2880"/>
+        </w:tabs>
+        <w:ind w:left="2880" w:hanging="360"/>
+      </w:pPr>
+      <w:rPr>
+        <w:rFonts w:ascii="Wingdings" w:hAnsi="Wingdings" w:hint="default"/>
+        <w:sz w:val="20"/>
+      </w:rPr>
+    </w:lvl>
+    <w:lvl w:ilvl="4" w:tentative="1">
+      <w:start w:val="1"/>
+      <w:numFmt w:val="bullet"/>
+      <w:lvlText w:val=""/>
+      <w:lvlJc w:val="left"/>
+      <w:pPr>
+        <w:tabs>
+          <w:tab w:val="num" w:pos="3600"/>
+        </w:tabs>
+        <w:ind w:left="3600" w:hanging="360"/>
+      </w:pPr>
+      <w:rPr>
+        <w:rFonts w:ascii="Wingdings" w:hAnsi="Wingdings" w:hint="default"/>
+        <w:sz w:val="20"/>
+      </w:rPr>
+    </w:lvl>
+    <w:lvl w:ilvl="5" w:tentative="1">
+      <w:start w:val="1"/>
+      <w:numFmt w:val="bullet"/>
+      <w:lvlText w:val=""/>
+      <w:lvlJc w:val="left"/>
+      <w:pPr>
+        <w:tabs>
+          <w:tab w:val="num" w:pos="4320"/>
+        </w:tabs>
+        <w:ind w:left="4320" w:hanging="360"/>
+      </w:pPr>
+      <w:rPr>
+        <w:rFonts w:ascii="Wingdings" w:hAnsi="Wingdings" w:hint="default"/>
+        <w:sz w:val="20"/>
+      </w:rPr>
+    </w:lvl>
+    <w:lvl w:ilvl="6" w:tentative="1">
+      <w:start w:val="1"/>
+      <w:numFmt w:val="bullet"/>
+      <w:lvlText w:val=""/>
+      <w:lvlJc w:val="left"/>
+      <w:pPr>
+        <w:tabs>
+          <w:tab w:val="num" w:pos="5040"/>
+        </w:tabs>
+        <w:ind w:left="5040" w:hanging="360"/>
+      </w:pPr>
+      <w:rPr>
+        <w:rFonts w:ascii="Wingdings" w:hAnsi="Wingdings" w:hint="default"/>
+        <w:sz w:val="20"/>
+      </w:rPr>
+    </w:lvl>
+    <w:lvl w:ilvl="7" w:tentative="1">
+      <w:start w:val="1"/>
+      <w:numFmt w:val="bullet"/>
+      <w:lvlText w:val=""/>
+      <w:lvlJc w:val="left"/>
+      <w:pPr>
+        <w:tabs>
+          <w:tab w:val="num" w:pos="5760"/>
+        </w:tabs>
+        <w:ind w:left="5760" w:hanging="360"/>
+      </w:pPr>
+      <w:rPr>
+        <w:rFonts w:ascii="Wingdings" w:hAnsi="Wingdings" w:hint="default"/>
+        <w:sz w:val="20"/>
+      </w:rPr>
+    </w:lvl>
+    <w:lvl w:ilvl="8" w:tentative="1">
+      <w:start w:val="1"/>
+      <w:numFmt w:val="bullet"/>
+      <w:lvlText w:val=""/>
+      <w:lvlJc w:val="left"/>
+      <w:pPr>
+        <w:tabs>
+          <w:tab w:val="num" w:pos="6480"/>
+        </w:tabs>
+        <w:ind w:left="6480" w:hanging="360"/>
+      </w:pPr>
+      <w:rPr>
+        <w:rFonts w:ascii="Wingdings" w:hAnsi="Wingdings" w:hint="default"/>
+        <w:sz w:val="20"/>
+      </w:rPr>
+    </w:lvl>
+  </w:abstractNum>
+  <w:abstractNum w:abstractNumId="3" w15:restartNumberingAfterBreak="0">
     <w:nsid w:val="57D71168"/>
     <w:multiLevelType w:val="hybridMultilevel"/>
     <w:tmpl w:val="7226A190"/>
@@ -6374,7 +6784,7 @@
       </w:rPr>
     </w:lvl>
   </w:abstractNum>
-  <w:abstractNum w:abstractNumId="3" w15:restartNumberingAfterBreak="0">
+  <w:abstractNum w:abstractNumId="4" w15:restartNumberingAfterBreak="0">
     <w:nsid w:val="621C1187"/>
     <w:multiLevelType w:val="hybridMultilevel"/>
     <w:tmpl w:val="555C3ADC"/>
@@ -6487,7 +6897,7 @@
       </w:rPr>
     </w:lvl>
   </w:abstractNum>
-  <w:abstractNum w:abstractNumId="4" w15:restartNumberingAfterBreak="0">
+  <w:abstractNum w:abstractNumId="5" w15:restartNumberingAfterBreak="0">
     <w:nsid w:val="68E144D8"/>
     <w:multiLevelType w:val="multilevel"/>
     <w:tmpl w:val="C354F62C"/>
@@ -6637,7 +7047,7 @@
     </w:lvl>
   </w:abstractNum>
   <w:num w:numId="1" w16cid:durableId="608972721">
-    <w:abstractNumId w:val="2"/>
+    <w:abstractNumId w:val="3"/>
   </w:num>
   <w:num w:numId="2" w16cid:durableId="916942382">
     <w:abstractNumId w:val="0"/>
@@ -6646,10 +7056,13 @@
     <w:abstractNumId w:val="1"/>
   </w:num>
   <w:num w:numId="4" w16cid:durableId="2012681646">
-    <w:abstractNumId w:val="3"/>
+    <w:abstractNumId w:val="4"/>
   </w:num>
   <w:num w:numId="5" w16cid:durableId="1299187959">
-    <w:abstractNumId w:val="4"/>
+    <w:abstractNumId w:val="5"/>
+  </w:num>
+  <w:num w:numId="6" w16cid:durableId="1277369461">
+    <w:abstractNumId w:val="2"/>
   </w:num>
 </w:numbering>
 </file>

</xml_diff>